<commit_message>
Clarify FY2027 open campus opinion and sources
</commit_message>
<xml_diff>
--- a/openCampusPlannning/令和9年度OC日程等に関する意見_応用情報工学科_更新版2.docx
+++ b/openCampusPlannning/令和9年度OC日程等に関する意見_応用情報工学科_更新版2.docx
@@ -238,7 +238,7 @@
           <w:sz w:val="21"/>
           <w:szCs w:val="21"/>
         </w:rPr>
-        <w:t xml:space="preserve"> 委員会では「報告事項」として「決定済み」と説明されました。しかし、前日の教授会で審議された学事日程表とは日程が異なっており、どの会議体で決定されたのか疑義があります。変更を決めた経緯を明らかにし、各学科で検討する時間を設けてください。</w:t>
+        <w:t xml:space="preserve"> 日程案は審議事項ではなく報告事項として示されました。前日の教授会資料に記載された学事日程表とも日程が異なっています。現在の決定状況とこれまでの経緯を説明し、各学科で検討する時間を設けてください。</w:t>
       </w:r>
     </w:p>
     <w:p>
@@ -378,7 +378,7 @@
           <w:sz w:val="21"/>
           <w:szCs w:val="21"/>
         </w:rPr>
-        <w:t>本件は、広報委員会で改めて審議すべきだと考えます。資料上は「変更案」ですが、当日は「決定済み」と説明されており、まず、その経緯を確認したいと思います。</w:t>
+        <w:t>本件は、広報委員会で改めて審議すべきだと考えます。今回の日程案は、審議事項ではなく報告事項として示されました。当日の説明からは、この案を前提に進めるものと受け止めましたが、決定済みなのか、今後変更の余地があるのかは確認できていません。</w:t>
       </w:r>
     </w:p>
     <w:p>
@@ -417,10 +417,32 @@
       <w:r>
         <w:rPr>
           <w:rFonts w:ascii="Century" w:cs="Century" w:eastAsia="ＭＳ 明朝" w:hAnsi="Century"/>
-          <w:sz w:val="21"/>
-          <w:szCs w:val="21"/>
-        </w:rPr>
-        <w:t>一方、委員会の場では「すでに決定しており変更しない」と説明されました。委員２名から負担増への懸念が示され、別の１名からは、付属高校生への対応はできる範囲でよいのか、という質問がありました。議題が当日に初めて示されたため、限られた時間では議論できませんでした。</w:t>
+          <w:b w:val="0"/>
+          <w:color w:val="000000"/>
+          <w:sz w:val="21"/>
+          <w:szCs w:val="21"/>
+        </w:rPr>
+        <w:t>同じ委員会の審議資料2にあるR9事業内容（案）（p.84）では、OC関連のR9年度欄に「開催時期検討」と記載されています。また、日程変更案（p.81）にも「日程決定後、速やかに付属高校へ連絡」とあります。これらの記載と、報告事項として示された日程案との関係を確認したいと思います。</w:t>
+      </w:r>
+    </w:p>
+    <w:p>
+      <w:pPr>
+        <w:pStyle w:val="ListParagraph"/>
+        <w:widowControl/>
+        <w:numPr>
+          <w:ilvl w:val="0"/>
+          <w:numId w:val="3"/>
+        </w:numPr>
+        <w:spacing w:after="40" w:line="300" w:lineRule="exact"/>
+        <w:snapToGrid w:val="0"/>
+      </w:pPr>
+      <w:r>
+        <w:rPr>
+          <w:rFonts w:ascii="Century" w:cs="Century" w:eastAsia="ＭＳ 明朝" w:hAnsi="Century"/>
+          <w:sz w:val="21"/>
+          <w:szCs w:val="21"/>
+        </w:rPr>
+        <w:t>委員２名から負担増への懸念が示され、別の１名からは、付属高校生への対応はできる範囲でよいのか、という質問がありました。議題が当日に初めて示されたため、限られた時間では議論できませんでした。</w:t>
       </w:r>
     </w:p>
     <w:p>
@@ -965,7 +987,7 @@
           <w:sz w:val="21"/>
           <w:szCs w:val="21"/>
         </w:rPr>
-        <w:t>教授会資料の日程から、どのような経緯で今回の案になったのか、また、どの会議体で決定されたのかについて疑義があります。すでに決定済みであれば、決定した会議体と日付、承認の手続きをお示しください。担当主任会議・教授会での扱いも確認したうえで、次回の広報委員会で改めて審議するようお願いします。</w:t>
+        <w:t>教授会資料の日程から今回の案に至った経緯と、現在の決定状況を教えてください。すでに決定済みであれば、決定した会議体と日付、承認の手続きをお示しください。担当主任会議・教授会での扱いも確認し、各学科の意見を聞く機会を設けたうえで、次回の広報委員会で改めて審議するようお願いします。</w:t>
       </w:r>
     </w:p>
     <w:p>
@@ -2165,7 +2187,7 @@
           <w:sz w:val="21"/>
           <w:szCs w:val="21"/>
         </w:rPr>
-        <w:t>学生への謝金が支払われていないことは、長年の課題です。</w:t>
+        <w:t>OCに協力する学生への謝金は学部から支給されておらず、長年の課題となっています。</w:t>
       </w:r>
       <w:r>
         <w:rPr>
@@ -3259,7 +3281,7 @@
           <w:sz w:val="21"/>
           <w:szCs w:val="21"/>
         </w:rPr>
-        <w:t xml:space="preserve"> 回答は駿河台165件、船橋556件で、来場者全体の意見を代表しているとは限りません。希望する開催時期や、施設を見学しなかった理由、併願先は尋ねていません。また、p.59〜60の施設別集計は学科・施設の重複選択を含むため、その合計から参加者の未見学率や前年比を求めることはできません。</w:t>
+        <w:t xml:space="preserve"> アンケートの回答が、来場者全体の意見を代表しているとは限りません。希望する開催時期や、施設を見学しなかった理由、併願先は尋ねていません。また、p.59〜60の施設別集計は学科・施設の重複選択を含むため、その合計から参加者の未見学率や前年比を求めることはできません。</w:t>
       </w:r>
     </w:p>
     <w:p>
@@ -3355,7 +3377,7 @@
           <w:sz w:val="21"/>
           <w:szCs w:val="21"/>
         </w:rPr>
-        <w:t>資料（p.80）では、広報委員会の「報告事項」に含まれる「変更案」となっています。各学科に持ち帰って教室会議などで検討し、委員会で審議する機会を設けるべきです。担当主任会議・教授会での扱いも含め、「決定済み」とされる経緯を説明してほしい。</w:t>
+        <w:t>資料（p.80）では、広報委員会の「報告事項」に含まれる「変更案」となっています。各学科に持ち帰って教室会議などで検討し、委員会で審議する機会を設けるべきです。担当主任会議・教授会での扱いも含め、今回の日程案がどこまで決まっているのか説明してほしい。</w:t>
       </w:r>
     </w:p>
     <w:p>
@@ -3377,7 +3399,7 @@
           <w:sz w:val="21"/>
           <w:szCs w:val="21"/>
         </w:rPr>
-        <w:t>教授会の直後の委員会で決定済みと説明されても、十分な説明がなく、経緯が分かりません。</w:t>
+        <w:t>今回の日程案について、十分な説明がなく、経緯が分かりません。</w:t>
       </w:r>
     </w:p>
     <w:p>
@@ -3399,7 +3421,7 @@
           <w:sz w:val="21"/>
           <w:szCs w:val="21"/>
         </w:rPr>
-        <w:t>全学科の教職員と学生が関わる行事です。委員会で議論する余地がないのであれば、委員会を設置している意味が問われます。現状の進め方には承服しかねます。</w:t>
+        <w:t>全学科の教職員と学生が関わる行事です。委員会で十分に議論する機会がないまま、この案を前提に進めることには疑問があります。</w:t>
       </w:r>
     </w:p>
     <w:p>
@@ -3597,7 +3619,7 @@
           <w:sz w:val="21"/>
           <w:szCs w:val="21"/>
         </w:rPr>
-        <w:t>9/14の教授会資料にある日程と、翌日の広報委員会に示された案との関係を説明してください。教授会での審議結果と、今回の案を決定した会議体・日付も教えてください。未決定であれば、今後の審議・決定の手順をお示しください。</w:t>
+        <w:t>9/14の教授会資料にある日程と、翌日の広報委員会に示された案との関係を説明してください。教授会での審議結果と、今回の案がどこまで決まっているのかも教えてください。決定済みであれば決定した会議体と日付を、未決定であれば今後の審議・決定の手順と各学科の意見を反映する機会をお示しください。</w:t>
       </w:r>
     </w:p>
     <w:p>
@@ -3802,7 +3824,7 @@
           <w:sz w:val="21"/>
           <w:szCs w:val="21"/>
         </w:rPr>
-        <w:t>今回の日程変更について、どの資料をもとに、どのような検討を経て決めたのか、委員会で説明をお願いします。</w:t>
+        <w:t>今回の日程案について、どの資料をもとに、どのような検討を経て作成したのか、委員会で説明をお願いします。</w:t>
       </w:r>
     </w:p>
     <w:p>
@@ -4723,7 +4745,7 @@
                 <w:sz w:val="19"/>
                 <w:szCs w:val="19"/>
               </w:rPr>
-              <w:t>報告資料8（p.80〜81）日程変更案、報告資料2（p.5）船橋OC参加者数、報告資料3（p.41〜53）アンケート、報告資料4（p.54〜63）WGの振り返り、審議資料2（R9事業内容）</w:t>
+              <w:t>報告資料8（p.80〜81）日程変更案、報告資料2（p.5）船橋OC参加者数、報告資料3（p.41〜53）アンケート、報告資料4（p.54〜63）WGの振り返り、審議資料2（p.83〜84）R9事業内容（案）</w:t>
             </w:r>
           </w:p>
         </w:tc>
@@ -5040,70 +5062,6 @@
                 <w:t>2026年度</w:t>
               </w:r>
             </w:hyperlink>
-          </w:p>
-        </w:tc>
-      </w:tr>
-      <w:tr>
-        <w:trPr>
-          <w:tblHeader w:val="false"/>
-          <w:cantSplit/>
-        </w:trPr>
-        <w:tc>
-          <w:tcPr>
-            <w:tcW w:type="dxa" w:w="3400"/>
-            <w:tcBorders>
-              <w:top w:val="single" w:color="000000" w:sz="4"/>
-              <w:left w:val="single" w:color="000000" w:sz="4"/>
-              <w:bottom w:val="single" w:color="000000" w:sz="4"/>
-              <w:right w:val="single" w:color="000000" w:sz="4"/>
-            </w:tcBorders>
-            <w:tcMar>
-              <w:top w:type="dxa" w:w="40"/>
-              <w:left w:type="dxa" w:w="80"/>
-              <w:bottom w:type="dxa" w:w="40"/>
-              <w:right w:type="dxa" w:w="80"/>
-            </w:tcMar>
-          </w:tcPr>
-          <w:p>
-            <w:pPr>
-              <w:keepNext w:val="0"/>
-              <w:spacing w:after="0" w:line="260" w:lineRule="exact"/>
-              <w:snapToGrid w:val="0"/>
-            </w:pPr>
-            <w:r>
-              <w:rPr>
-                <w:rFonts w:ascii="Century" w:cs="Century" w:eastAsia="ＭＳ 明朝" w:hAnsi="Century"/>
-                <w:b w:val="false"/>
-                <w:bCs w:val="false"/>
-                <w:sz w:val="19"/>
-                <w:szCs w:val="19"/>
-              </w:rPr>
-              <w:t xml:space="preserve">応用情報工学科内のメール</w:t>
-            </w:r>
-          </w:p>
-        </w:tc>
-        <w:tc>
-          <w:tcPr>
-            <w:tcW w:type="dxa" w:w="6238"/>
-            <w:tcBorders>
-              <w:top w:val="single" w:color="000000" w:sz="4"/>
-              <w:left w:val="single" w:color="000000" w:sz="4"/>
-              <w:bottom w:val="single" w:color="000000" w:sz="4"/>
-              <w:right w:val="single" w:color="000000" w:sz="4"/>
-            </w:tcBorders>
-            <w:tcMar>
-              <w:top w:type="dxa" w:w="40"/>
-              <w:left w:type="dxa" w:w="80"/>
-              <w:bottom w:type="dxa" w:w="40"/>
-              <w:right w:type="dxa" w:w="80"/>
-            </w:tcMar>
-          </w:tcPr>
-          <w:p>
-            <w:pPr>
-              <w:keepNext w:val="0"/>
-              <w:spacing w:after="0" w:line="260" w:lineRule="exact"/>
-              <w:snapToGrid w:val="0"/>
-            </w:pPr>
             <w:r>
               <w:rPr>
                 <w:rFonts w:ascii="Century" w:cs="Century" w:eastAsia="ＭＳ 明朝" w:hAnsi="Century"/>
@@ -5113,7 +5071,8 @@
                 <w:sz w:val="19"/>
                 <w:szCs w:val="19"/>
               </w:rPr>
-              <w:t>2026年9月16日に寄せられた意見</w:t>
+              <w:br/>
+              <w:t>※2023年度は旧掲載URL。2026年9月23日現在、大学トップページへ転送されます。</w:t>
             </w:r>
           </w:p>
         </w:tc>

</xml_diff>